<commit_message>
added team journal WEEK 6
</commit_message>
<xml_diff>
--- a/Reports, Logs & Evaluations/Team Journal/Team Journal SDT213.docx
+++ b/Reports, Logs & Evaluations/Team Journal/Team Journal SDT213.docx
@@ -794,6 +794,150 @@
           <w:rtl w:val="0"/>
         </w:rPr>
         <w:t xml:space="preserve">: Use Case Diagram visual style, first steps of code implementation.</w:t>
+      </w:r>
+    </w:p>
+    <w:p>
+      <w:pPr>
+        <w:spacing w:line="360" w:lineRule="auto"/>
+        <w:rPr/>
+      </w:pPr>
+      <w:r>
+        <w:rPr>
+          <w:rtl w:val="0"/>
+        </w:rPr>
+      </w:r>
+    </w:p>
+    <w:p>
+      <w:pPr>
+        <w:rPr/>
+      </w:pPr>
+      <w:r>
+        <w:rPr>
+          <w:rtl w:val="0"/>
+        </w:rPr>
+        <w:t xml:space="preserve">Week 6: 19/10/26-25/10/26</w:t>
+      </w:r>
+    </w:p>
+    <w:p>
+      <w:pPr>
+        <w:spacing w:line="360" w:lineRule="auto"/>
+        <w:rPr/>
+      </w:pPr>
+      <w:r>
+        <w:rPr>
+          <w:rtl w:val="0"/>
+        </w:rPr>
+        <w:t xml:space="preserve">24/10/26 </w:t>
+      </w:r>
+      <w:hyperlink r:id="rId11">
+        <w:r>
+          <w:rPr>
+            <w:color w:val="1155cc"/>
+            <w:u w:val="single"/>
+            <w:rtl w:val="0"/>
+          </w:rPr>
+          <w:t xml:space="preserve">meeting link</w:t>
+        </w:r>
+      </w:hyperlink>
+      <w:r>
+        <w:rPr>
+          <w:rtl w:val="0"/>
+        </w:rPr>
+        <w:br w:type="textWrapping"/>
+      </w:r>
+      <w:r>
+        <w:rPr>
+          <w:i w:val="1"/>
+          <w:iCs w:val="1"/>
+          <w:rtl w:val="0"/>
+        </w:rPr>
+        <w:t xml:space="preserve">Discussed</w:t>
+      </w:r>
+      <w:r>
+        <w:rPr>
+          <w:rtl w:val="0"/>
+        </w:rPr>
+        <w:t xml:space="preserve">: Phase III, responsibilities among team members</w:t>
+      </w:r>
+    </w:p>
+    <w:p>
+      <w:pPr>
+        <w:spacing w:line="360" w:lineRule="auto"/>
+        <w:rPr/>
+      </w:pPr>
+      <w:r>
+        <w:rPr>
+          <w:i w:val="1"/>
+          <w:iCs w:val="1"/>
+          <w:rtl w:val="0"/>
+        </w:rPr>
+        <w:t xml:space="preserve">Decisions</w:t>
+      </w:r>
+      <w:r>
+        <w:rPr>
+          <w:rtl w:val="0"/>
+        </w:rPr>
+        <w:t xml:space="preserve">: Meet client. Rough spheres of responsibilities.</w:t>
+      </w:r>
+    </w:p>
+    <w:p>
+      <w:pPr>
+        <w:spacing w:line="360" w:lineRule="auto"/>
+        <w:rPr/>
+      </w:pPr>
+      <w:r>
+        <w:rPr>
+          <w:i w:val="1"/>
+          <w:iCs w:val="1"/>
+          <w:rtl w:val="0"/>
+        </w:rPr>
+        <w:t xml:space="preserve">Previous tasks completion</w:t>
+      </w:r>
+      <w:r>
+        <w:rPr>
+          <w:rtl w:val="0"/>
+        </w:rPr>
+        <w:t xml:space="preserve">: Phase II completed excellently.</w:t>
+      </w:r>
+    </w:p>
+    <w:p>
+      <w:pPr>
+        <w:spacing w:line="360" w:lineRule="auto"/>
+        <w:rPr/>
+      </w:pPr>
+      <w:r>
+        <w:rPr>
+          <w:i w:val="1"/>
+          <w:iCs w:val="1"/>
+          <w:rtl w:val="0"/>
+        </w:rPr>
+        <w:t xml:space="preserve">Planned tasks for the week</w:t>
+      </w:r>
+      <w:r>
+        <w:rPr>
+          <w:rtl w:val="0"/>
+        </w:rPr>
+        <w:t xml:space="preserve">: Initial planning and decisions, client &amp; instructor meeting </w:t>
+      </w:r>
+    </w:p>
+    <w:p>
+      <w:pPr>
+        <w:spacing w:line="360" w:lineRule="auto"/>
+        <w:rPr/>
+      </w:pPr>
+      <w:r>
+        <w:rPr>
+          <w:i w:val="1"/>
+          <w:iCs w:val="1"/>
+          <w:rtl w:val="0"/>
+        </w:rPr>
+        <w:t xml:space="preserve">Issues</w:t>
+      </w:r>
+      <w:r>
+        <w:rPr>
+          <w:rtl w:val="0"/>
+        </w:rPr>
+        <w:t xml:space="preserve">: Unclear amount of work to be done for Phase III, resolve client’s wishes if any, precise development plan incomplete.</w:t>
       </w:r>
     </w:p>
     <w:sectPr>

</xml_diff>